<commit_message>
Regenerate exact text-only dissertation DOCX
</commit_message>
<xml_diff>
--- a/论文对比资料_2026-08-23/09_完整显示设计与数据讨论论文_2026-08-24/行为树论文_中文_完整显示设计与数据讨论版_2026-08-24.docx
+++ b/论文对比资料_2026-08-23/09_完整显示设计与数据讨论论文_2026-08-24/行为树论文_中文_完整显示设计与数据讨论版_2026-08-24.docx
@@ -809,7 +809,7 @@
         <w:jc w:val="center"/>
       </w:pPr>
       <w:r>
-        <w:t>W_c=35W_cm, ， H_c=35H_cm,</w:t>
+        <w:t>W_c=35W_cm, H_c=35H_cm,</w:t>
       </w:r>
     </w:p>
     <w:p>
@@ -1271,7 +1271,7 @@
     <w:p>
       <w:pPr/>
       <w:r>
-        <w:t>Epic Games (2026). Behavior Tree in Unreal Engine: Overview. https://dev.epicgames.com/documentation/en-us/unreal-engine/behavior-tree-in-unreal-engine–-overview.</w:t>
+        <w:t>Epic Games (2026). Behavior Tree in Unreal Engine: Overview. https://dev.epicgames.com/documentation/en-us/unreal-engine/behavior-tree-in-unreal-engine---overview.</w:t>
       </w:r>
     </w:p>
     <w:p>

</xml_diff>